<commit_message>
feat: new RBAC,agreement and user improvments
</commit_message>
<xml_diff>
--- a/ESCOPO-TECNICO-ADITIVO.docx
+++ b/ESCOPO-TECNICO-ADITIVO.docx
@@ -505,6 +505,7 @@
         <w:spacing w:before="53"/>
         <w:ind w:left="120"/>
         <w:rPr>
+          <w:color w:val="212121"/>
           <w:sz w:val="15"/>
         </w:rPr>
       </w:pPr>
@@ -522,6 +523,44 @@
           <w:sz w:val="15"/>
         </w:rPr>
         <w:t>40 horas</w:t>
+      </w:r>
+    </w:p>
+    <w:p>
+      <w:pPr>
+        <w:spacing w:before="53"/>
+        <w:ind w:left="120"/>
+        <w:rPr>
+          <w:sz w:val="15"/>
+        </w:rPr>
+      </w:pPr>
+    </w:p>
+    <w:p>
+      <w:pPr>
+        <w:spacing w:before="53"/>
+        <w:ind w:left="120"/>
+        <w:rPr>
+          <w:sz w:val="15"/>
+        </w:rPr>
+      </w:pPr>
+    </w:p>
+    <w:p>
+      <w:pPr>
+        <w:spacing w:before="53"/>
+        <w:ind w:left="120"/>
+        <w:rPr>
+          <w:color w:val="FF0000"/>
+          <w:sz w:val="18"/>
+          <w:szCs w:val="28"/>
+        </w:rPr>
+      </w:pPr>
+      <w:r>
+        <w:rPr>
+          <w:b/>
+          <w:bCs/>
+          <w:color w:val="FF0000"/>
+          <w:spacing w:val="-5"/>
+        </w:rPr>
+        <w:t>FEITO</w:t>
       </w:r>
     </w:p>
     <w:p>
@@ -590,7 +629,40 @@
           <w:sz w:val="18"/>
           <w:szCs w:val="18"/>
         </w:rPr>
-        <w:t xml:space="preserve">Convênios </w:t>
+        <w:t>Convênios</w:t>
+      </w:r>
+      <w:r>
+        <w:rPr>
+          <w:b/>
+          <w:bCs/>
+          <w:color w:val="212121"/>
+          <w:spacing w:val="-5"/>
+          <w:sz w:val="18"/>
+          <w:szCs w:val="18"/>
+        </w:rPr>
+        <w:t xml:space="preserve"> </w:t>
+      </w:r>
+      <w:r>
+        <w:rPr>
+          <w:b/>
+          <w:bCs/>
+          <w:color w:val="212121"/>
+          <w:spacing w:val="-5"/>
+          <w:sz w:val="18"/>
+          <w:szCs w:val="18"/>
+        </w:rPr>
+        <w:t xml:space="preserve"> </w:t>
+      </w:r>
+      <w:r>
+        <w:rPr>
+          <w:b/>
+          <w:bCs/>
+          <w:color w:val="212121"/>
+          <w:spacing w:val="-5"/>
+          <w:sz w:val="18"/>
+          <w:szCs w:val="18"/>
+        </w:rPr>
+        <w:t xml:space="preserve"> </w:t>
       </w:r>
       <w:r>
         <w:rPr>
@@ -1313,6 +1385,7 @@
           <w:color w:val="212121"/>
           <w:sz w:val="15"/>
         </w:rPr>
+        <w:lastRenderedPageBreak/>
         <w:t xml:space="preserve">Estimativa: </w:t>
       </w:r>
       <w:r>
@@ -2034,13 +2107,7 @@
         <w:rPr>
           <w:color w:val="212121"/>
         </w:rPr>
-        <w:t>Confirmação de Agendamento</w:t>
-      </w:r>
-      <w:r>
-        <w:rPr>
-          <w:color w:val="212121"/>
-        </w:rPr>
-        <w:t xml:space="preserve"> </w:t>
+        <w:t xml:space="preserve">Confirmação de Agendamento </w:t>
       </w:r>
       <w:r>
         <w:rPr>
@@ -2054,9 +2121,6 @@
         <w:pStyle w:val="BodyText"/>
         <w:spacing w:line="292" w:lineRule="auto"/>
         <w:ind w:left="720" w:right="6413"/>
-        <w:rPr>
-          <w:lang w:val="en-US"/>
-        </w:rPr>
       </w:pPr>
       <w:r>
         <w:pict w14:anchorId="7EE8A167">
@@ -2087,7 +2151,6 @@
       <w:r>
         <w:rPr>
           <w:color w:val="212121"/>
-          <w:lang w:val="en-US"/>
         </w:rPr>
         <w:t>Check-in</w:t>
       </w:r>
@@ -2634,6 +2697,7 @@
         <w:ind w:left="720" w:right="7113"/>
       </w:pPr>
       <w:r>
+        <w:lastRenderedPageBreak/>
         <w:pict w14:anchorId="173A6035">
           <v:group id="_x0000_s1426" style="position:absolute;left:0;text-align:left;margin-left:76.9pt;margin-top:5.5pt;width:3pt;height:3pt;z-index:251783168;mso-position-horizontal-relative:page" coordorigin="1538,110" coordsize="60,60">
             <v:shape id="_x0000_s1428" style="position:absolute;left:1545;top:117;width:45;height:45" coordorigin="1545,118" coordsize="45,45" path="m1580,163r-25,l1545,153r,-25l1555,118r25,l1590,128r,25l1580,163xe" fillcolor="#212121" stroked="f">
@@ -4043,6 +4107,7 @@
           <w:color w:val="212121"/>
           <w:sz w:val="15"/>
         </w:rPr>
+        <w:lastRenderedPageBreak/>
         <w:t xml:space="preserve">Estimativa: </w:t>
       </w:r>
       <w:r>
@@ -4093,7 +4158,6 @@
           <w:color w:val="212121"/>
           <w:spacing w:val="-5"/>
         </w:rPr>
-        <w:lastRenderedPageBreak/>
         <w:t xml:space="preserve">Evolução </w:t>
       </w:r>
       <w:r>
@@ -5928,7 +5992,6 @@
           <w:color w:val="212121"/>
           <w:sz w:val="18"/>
         </w:rPr>
-        <w:lastRenderedPageBreak/>
         <w:t>Breakdown</w:t>
       </w:r>
       <w:proofErr w:type="spellEnd"/>

</xml_diff>